<commit_message>
chore(treinamentos): injeta dados mockados de presenca para teste de ata
</commit_message>
<xml_diff>
--- a/web/public/RQ TREIN01.docx
+++ b/web/public/RQ TREIN01.docx
@@ -516,23 +516,7 @@
                 <w:sz w:val="20"/>
                 <w:szCs w:val="20"/>
               </w:rPr>
-              <w:t>{#</w:t>
-            </w:r>
-            <w:proofErr w:type="gramStart"/>
-            <w:r>
-              <w:rPr>
-                <w:sz w:val="20"/>
-                <w:szCs w:val="20"/>
-              </w:rPr>
-              <w:t>presencas}{</w:t>
-            </w:r>
-            <w:proofErr w:type="gramEnd"/>
-            <w:r>
-              <w:rPr>
-                <w:sz w:val="20"/>
-                <w:szCs w:val="20"/>
-              </w:rPr>
-              <w:t>nome}</w:t>
+              <w:t>{#presencas}{nome}</w:t>
             </w:r>
           </w:p>
         </w:tc>
@@ -573,39 +557,7 @@
                 <w:sz w:val="20"/>
                 <w:szCs w:val="20"/>
               </w:rPr>
-              <w:t>{</w:t>
-            </w:r>
-            <w:proofErr w:type="spellStart"/>
-            <w:r>
-              <w:rPr>
-                <w:sz w:val="20"/>
-                <w:szCs w:val="20"/>
-              </w:rPr>
-              <w:t>horario</w:t>
-            </w:r>
-            <w:proofErr w:type="spellEnd"/>
-            <w:r>
-              <w:rPr>
-                <w:sz w:val="20"/>
-                <w:szCs w:val="20"/>
-              </w:rPr>
-              <w:t>}{/</w:t>
-            </w:r>
-            <w:proofErr w:type="spellStart"/>
-            <w:r>
-              <w:rPr>
-                <w:sz w:val="20"/>
-                <w:szCs w:val="20"/>
-              </w:rPr>
-              <w:t>presencas</w:t>
-            </w:r>
-            <w:proofErr w:type="spellEnd"/>
-            <w:r>
-              <w:rPr>
-                <w:sz w:val="20"/>
-                <w:szCs w:val="20"/>
-              </w:rPr>
-              <w:t>}</w:t>
+              <w:t>{horario}{/presencas}</w:t>
             </w:r>
           </w:p>
         </w:tc>
@@ -1152,7 +1104,7 @@
                 <v:path o:extrusionok="f" gradientshapeok="t" o:connecttype="rect"/>
                 <o:lock v:ext="edit" aspectratio="t"/>
               </v:shapetype>
-              <v:shape id="Imagem 1" o:spid="_x0000_i1025" type="#_x0000_t75" style="width:110.2pt;height:110.2pt;visibility:visible">
+              <v:shape id="Imagem 1" o:spid="_x0000_i1025" type="#_x0000_t75" style="width:110.35pt;height:110.35pt;visibility:visible">
                 <v:imagedata r:id="rId1" o:title=""/>
               </v:shape>
             </w:pict>

</xml_diff>

<commit_message>
feat: initialize project with backend, UI components, and chat services
</commit_message>
<xml_diff>
--- a/web/public/RQ TREIN01.docx
+++ b/web/public/RQ TREIN01.docx
@@ -167,21 +167,21 @@
           <w:sz w:val="20"/>
           <w:szCs w:val="20"/>
         </w:rPr>
-        <w:t xml:space="preserve">POP </w:t>
-      </w:r>
-      <w:r>
-        <w:rPr>
-          <w:sz w:val="20"/>
-          <w:szCs w:val="20"/>
-        </w:rPr>
-        <w:t>EXPEDIÇÃO</w:t>
-      </w:r>
-      <w:r>
-        <w:rPr>
-          <w:sz w:val="20"/>
-          <w:szCs w:val="20"/>
-        </w:rPr>
-        <w:t xml:space="preserve"> DE PRODUTOS</w:t>
+        <w:t>{</w:t>
+      </w:r>
+      <w:r>
+        <w:rPr>
+          <w:sz w:val="20"/>
+          <w:szCs w:val="20"/>
+        </w:rPr>
+        <w:t>a</w:t>
+      </w:r>
+      <w:r>
+        <w:rPr>
+          <w:sz w:val="20"/>
+          <w:szCs w:val="20"/>
+        </w:rPr>
+        <w:t>rea}</w:t>
       </w:r>
     </w:p>
     <w:p>
@@ -516,7 +516,23 @@
                 <w:sz w:val="20"/>
                 <w:szCs w:val="20"/>
               </w:rPr>
-              <w:t>{#presencas}{nome}</w:t>
+              <w:t>{#</w:t>
+            </w:r>
+            <w:proofErr w:type="gramStart"/>
+            <w:r>
+              <w:rPr>
+                <w:sz w:val="20"/>
+                <w:szCs w:val="20"/>
+              </w:rPr>
+              <w:t>presencas}{</w:t>
+            </w:r>
+            <w:proofErr w:type="gramEnd"/>
+            <w:r>
+              <w:rPr>
+                <w:sz w:val="20"/>
+                <w:szCs w:val="20"/>
+              </w:rPr>
+              <w:t>nome}</w:t>
             </w:r>
           </w:p>
         </w:tc>
@@ -557,7 +573,39 @@
                 <w:sz w:val="20"/>
                 <w:szCs w:val="20"/>
               </w:rPr>
-              <w:t>{horario}{/presencas}</w:t>
+              <w:t>{</w:t>
+            </w:r>
+            <w:proofErr w:type="spellStart"/>
+            <w:r>
+              <w:rPr>
+                <w:sz w:val="20"/>
+                <w:szCs w:val="20"/>
+              </w:rPr>
+              <w:t>horario</w:t>
+            </w:r>
+            <w:proofErr w:type="spellEnd"/>
+            <w:r>
+              <w:rPr>
+                <w:sz w:val="20"/>
+                <w:szCs w:val="20"/>
+              </w:rPr>
+              <w:t>}{/</w:t>
+            </w:r>
+            <w:proofErr w:type="spellStart"/>
+            <w:r>
+              <w:rPr>
+                <w:sz w:val="20"/>
+                <w:szCs w:val="20"/>
+              </w:rPr>
+              <w:t>presencas</w:t>
+            </w:r>
+            <w:proofErr w:type="spellEnd"/>
+            <w:r>
+              <w:rPr>
+                <w:sz w:val="20"/>
+                <w:szCs w:val="20"/>
+              </w:rPr>
+              <w:t>}</w:t>
             </w:r>
           </w:p>
         </w:tc>
@@ -1104,7 +1152,7 @@
                 <v:path o:extrusionok="f" gradientshapeok="t" o:connecttype="rect"/>
                 <o:lock v:ext="edit" aspectratio="t"/>
               </v:shapetype>
-              <v:shape id="Imagem 1" o:spid="_x0000_i1025" type="#_x0000_t75" style="width:110.35pt;height:110.35pt;visibility:visible">
+              <v:shape id="Imagem 1" o:spid="_x0000_i1025" type="#_x0000_t75" style="width:110.5pt;height:110.5pt;visibility:visible">
                 <v:imagedata r:id="rId1" o:title=""/>
               </v:shape>
             </w:pict>
@@ -2147,11 +2195,15 @@
   </w:style>
   <w:style w:type="character" w:default="1" w:styleId="Fontepargpadro">
     <w:name w:val="Default Paragraph Font"/>
+    <w:uiPriority w:val="1"/>
     <w:semiHidden/>
+    <w:unhideWhenUsed/>
   </w:style>
   <w:style w:type="table" w:default="1" w:styleId="Tabelanormal">
     <w:name w:val="Normal Table"/>
+    <w:uiPriority w:val="99"/>
     <w:semiHidden/>
+    <w:unhideWhenUsed/>
     <w:tblPr>
       <w:tblInd w:w="0" w:type="dxa"/>
       <w:tblCellMar>
@@ -2164,7 +2216,9 @@
   </w:style>
   <w:style w:type="numbering" w:default="1" w:styleId="Semlista">
     <w:name w:val="No List"/>
+    <w:uiPriority w:val="99"/>
     <w:semiHidden/>
+    <w:unhideWhenUsed/>
   </w:style>
   <w:style w:type="paragraph" w:styleId="Cabealho">
     <w:name w:val="header"/>

</xml_diff>